<commit_message>
Fix false Kerph tool catalog claims across 5 Garage Tips articles
Articles 03, 05, 07, 08, and 14 each closed with a CTA sending readers to
"Kerph's tool catalog" to browse measuring tools, push sticks/featherboards,
respirators, finishing supplies, or sharpening stones -- none of which are
actually in the catalog (it's power tools and equipment only, confirmed
against catalog-data.js). Every product mentioned was already real-linked
via Amazon search links earlier in each article; the closing line was both
false and redundant. Replaced with accurate callbacks: the tool maintenance
tracker (which logs anything you own, not just catalog items) for 03/07/14,
a real featherboard affiliate link + tracker for 05, and a Portfolio-notes
mention for 08 since tracking isn't really the fit there.
</commit_message>
<xml_diff>
--- a/Articles/07-choosing-a-respirator/article.docx
+++ b/Articles/07-choosing-a-respirator/article.docx
@@ -291,7 +291,7 @@
     </w:p>
     <w:p>
       <w:r>
-        <w:t xml:space="preserve">Getting the right respirator is half the job. Knowing which cartridges to keep stocked, and when to actually replace them, is the other half — and it's the half most people skip. If you're building out your PPE alongside the rest of your shop equipment, </w:t>
+        <w:t xml:space="preserve">Getting the right respirator is half the job. Knowing which cartridges to keep stocked, and when to actually replace them, is the other half — and it's the half most people skip. Once your PPE kit is dialed in, </w:t>
       </w:r>
       <w:hyperlink r:id="rIdLink4">
         <w:r>
@@ -299,11 +299,11 @@
             <w:color w:val="1E3A8A"/>
             <w:u w:val="single"/>
           </w:rPr>
-          <w:t xml:space="preserve">browse the tool catalog</w:t>
+          <w:t xml:space="preserve">Kerph's tool maintenance tracker</w:t>
         </w:r>
       </w:hyperlink>
       <w:r>
-        <w:t xml:space="preserve"> to compare respirator models and keep track of what you already own.</w:t>
+        <w:t xml:space="preserve"> is a good place to log which cartridges you've got on hand and when they went into service, so a swap doesn't turn into guesswork mid-project.</w:t>
       </w:r>
     </w:p>
     <w:sectPr>

</xml_diff>